<commit_message>
Restyle export templates to the Thomas More house style
Both template.typ (PDF) and reference.docx (DOCX) now follow the official
TM course template: Century Gothic headings in orange/navy, Arial 12pt
body, headings numbered 1./1.1., A4 with TM margins, a page-number footer
with the orange rule, and a typographic cover with the TM logo. DOCX
alerts get twelve per-kind styles instead of one blue pair; Century
Gothic ships in templates/export/fonts/ and reaches Typst via
TYPST_FONT_PATHS, the cover logo via a new logo variable.

Co-Authored-By: Claude Fable 5 <noreply@anthropic.com>
</commit_message>
<xml_diff>
--- a/templates/export/reference.docx
+++ b/templates/export/reference.docx
@@ -314,9 +314,12 @@
       </w:r>
     </w:p>
     <w:sectPr>
+      <w:footerReference w:type="default" r:id="rId900"/>
       <w:footnotePr>
         <w:numRestart w:val="eachSect"/>
       </w:footnotePr>
+      <w:pgSz w:w="11906" w:h="16838"/>
+      <w:pgMar w:top="1418" w:right="1418" w:bottom="1304" w:left="1418" w:header="680" w:footer="284" w:gutter="0"/>
     </w:sectPr>
   </w:body>
 </w:document>
@@ -326,6 +329,32 @@
 <w:comments xmlns:w="http://schemas.openxmlformats.org/wordprocessingml/2006/main" xmlns:m="http://schemas.openxmlformats.org/officeDocument/2006/math" xmlns:r="http://schemas.openxmlformats.org/officeDocument/2006/relationships" xmlns:o="urn:schemas-microsoft-com:office:office" xmlns:v="urn:schemas-microsoft-com:vml" xmlns:w10="urn:schemas-microsoft-com:office:word" xmlns:a="http://schemas.openxmlformats.org/drawingml/2006/main" xmlns:pic="http://schemas.openxmlformats.org/drawingml/2006/picture" xmlns:wp="http://schemas.openxmlformats.org/drawingml/2006/wordprocessingDrawing"/>
 </file>
 
+<file path=word/footer1.xml><?xml version="1.0" encoding="utf-8"?>
+<w:ftr xmlns:w="http://schemas.openxmlformats.org/wordprocessingml/2006/main">
+  <w:p>
+    <w:pPr>
+      <w:pStyle w:val="Footer"/>
+      <w:jc w:val="center"/>
+    </w:pPr>
+    <w:r>
+      <w:fldChar w:fldCharType="begin"/>
+    </w:r>
+    <w:r>
+      <w:instrText xml:space="preserve"> PAGE </w:instrText>
+    </w:r>
+    <w:r>
+      <w:fldChar w:fldCharType="separate"/>
+    </w:r>
+    <w:r>
+      <w:t>1</w:t>
+    </w:r>
+    <w:r>
+      <w:fldChar w:fldCharType="end"/>
+    </w:r>
+  </w:p>
+</w:ftr>
+</file>
+
 <file path=word/footnotes.xml><?xml version="1.0" encoding="utf-8"?>
 <w:footnotes xmlns:w="http://schemas.openxmlformats.org/wordprocessingml/2006/main" xmlns:m="http://schemas.openxmlformats.org/officeDocument/2006/math" xmlns:r="http://schemas.openxmlformats.org/officeDocument/2006/relationships" xmlns:o="urn:schemas-microsoft-com:office:office" xmlns:v="urn:schemas-microsoft-com:vml" xmlns:w10="urn:schemas-microsoft-com:office:word" xmlns:a="http://schemas.openxmlformats.org/drawingml/2006/main" xmlns:pic="http://schemas.openxmlformats.org/drawingml/2006/picture" xmlns:wp="http://schemas.openxmlformats.org/drawingml/2006/wordprocessingDrawing">
   <w:footnote w:type="continuationSeparator" w:id="0">
@@ -371,6 +400,54 @@
 
 <file path=word/numbering.xml><?xml version="1.0" encoding="utf-8"?>
 <w:numbering xmlns:w="http://schemas.openxmlformats.org/wordprocessingml/2006/main">
+  <w:abstractNum w:abstractNumId="90">
+    <w:nsid w:val="09000090"/>
+    <w:multiLevelType w:val="multilevel"/>
+    <w:lvl w:ilvl="0">
+      <w:start w:val="1"/>
+      <w:numFmt w:val="decimal"/>
+      <w:pStyle w:val="Heading1"/>
+      <w:suff w:val="space"/>
+      <w:lvlText w:val="%1."/>
+      <w:lvlJc w:val="left"/>
+      <w:pPr>
+        <w:ind w:left="0" w:firstLine="0"/>
+      </w:pPr>
+    </w:lvl>
+    <w:lvl w:ilvl="1">
+      <w:start w:val="1"/>
+      <w:numFmt w:val="decimal"/>
+      <w:pStyle w:val="Heading2"/>
+      <w:suff w:val="space"/>
+      <w:lvlText w:val="%1.%2."/>
+      <w:lvlJc w:val="left"/>
+      <w:pPr>
+        <w:ind w:left="0" w:firstLine="0"/>
+      </w:pPr>
+    </w:lvl>
+    <w:lvl w:ilvl="2">
+      <w:start w:val="1"/>
+      <w:numFmt w:val="decimal"/>
+      <w:pStyle w:val="Heading3"/>
+      <w:suff w:val="space"/>
+      <w:lvlText w:val="%1.%2.%3."/>
+      <w:lvlJc w:val="left"/>
+      <w:pPr>
+        <w:ind w:left="0" w:firstLine="0"/>
+      </w:pPr>
+    </w:lvl>
+    <w:lvl w:ilvl="3">
+      <w:start w:val="1"/>
+      <w:numFmt w:val="decimal"/>
+      <w:pStyle w:val="Heading4"/>
+      <w:suff w:val="space"/>
+      <w:lvlText w:val="%1.%2.%3.%4."/>
+      <w:lvlJc w:val="left"/>
+      <w:pPr>
+        <w:ind w:left="0" w:firstLine="0"/>
+      </w:pPr>
+    </w:lvl>
+  </w:abstractNum>
   <w:abstractNum w:abstractNumId="990">
     <w:nsid w:val="170cd2de"/>
     <w:multiLevelType w:val="multilevel"/>
@@ -474,6 +551,9 @@
       </w:pPr>
     </w:lvl>
   </w:abstractNum>
+  <w:num w:numId="900">
+    <w:abstractNumId w:val="90"/>
+  </w:num>
   <w:num w:numId="1000">
     <w:abstractNumId w:val="990"/>
   </w:num>
@@ -488,12 +568,12 @@
         <w:rFonts w:asciiTheme="minorHAnsi" w:eastAsiaTheme="minorEastAsia" w:hAnsiTheme="minorHAnsi" w:cstheme="minorBidi"/>
         <w:sz w:val="24"/>
         <w:szCs w:val="24"/>
-        <w:lang w:val="en-US" w:eastAsia="zh-CN" w:bidi="ar-SA"/>
+        <w:lang w:val="nl-BE" w:eastAsia="zh-CN" w:bidi="ar-SA"/>
       </w:rPr>
     </w:rPrDefault>
     <w:pPrDefault>
       <w:pPr>
-        <w:spacing w:after="200"/>
+        <w:spacing w:after="240" w:line="264" w:lineRule="auto"/>
       </w:pPr>
     </w:pPrDefault>
   </w:docDefaults>
@@ -508,7 +588,7 @@
     <w:link w:val="BodyTextChar"/>
     <w:qFormat/>
     <w:pPr>
-      <w:spacing w:before="180" w:after="180"/>
+      <w:spacing w:before="0" w:after="240"/>
     </w:pPr>
   </w:style>
   <w:style w:type="paragraph" w:customStyle="1" w:styleId="FirstParagraph">
@@ -532,16 +612,16 @@
     <w:link w:val="TitleChar"/>
     <w:uiPriority w:val="10"/>
     <w:qFormat/>
-    <w:rsid w:val="00A10FD9"/>
-    <w:pPr>
-      <w:spacing w:after="80" w:line="240" w:lineRule="auto"/>
+    <w:pPr>
+      <w:spacing w:after="240" w:line="240" w:lineRule="auto"/>
       <w:contextualSpacing/>
-      <w:jc w:val="center"/>
     </w:pPr>
     <w:rPr>
       <w:rFonts w:asciiTheme="majorHAnsi" w:eastAsiaTheme="majorEastAsia" w:hAnsiTheme="majorHAnsi" w:cstheme="majorBidi"/>
-      <w:sz w:val="56"/>
-      <w:szCs w:val="56"/>
+      <w:b/>
+      <w:color w:val="FA6432"/>
+      <w:sz w:val="64"/>
+      <w:szCs w:val="64"/>
     </w:rPr>
   </w:style>
   <w:style w:type="character" w:customStyle="1" w:styleId="TitleChar">
@@ -563,17 +643,14 @@
     <w:link w:val="SubtitleChar"/>
     <w:uiPriority w:val="11"/>
     <w:qFormat/>
-    <w:rsid w:val="00A10FD9"/>
-    <w:pPr>
-      <w:numPr>
-        <w:ilvl w:val="1"/>
-      </w:numPr>
-    </w:pPr>
-    <w:rPr>
-      <w:rFonts w:eastAsiaTheme="majorEastAsia" w:cstheme="majorBidi"/>
+    <w:rPr>
+      <w:rFonts w:asciiTheme="majorHAnsi" w:eastAsiaTheme="majorEastAsia" w:hAnsiTheme="majorHAnsi" w:cstheme="majorBidi"/>
+      <w:b/>
+      <w:caps/>
+      <w:color w:val="00283C"/>
       <w:spacing w:val="15"/>
-      <w:sz w:val="28"/>
-      <w:szCs w:val="28"/>
+      <w:sz w:val="26"/>
+      <w:szCs w:val="26"/>
     </w:rPr>
   </w:style>
   <w:style w:type="character" w:customStyle="1" w:styleId="SubtitleChar">
@@ -665,13 +742,215 @@
     <w:link w:val="Heading1Char"/>
     <w:uiPriority w:val="9"/>
     <w:qFormat/>
+    <w:pPr>
+      <w:keepNext/>
+      <w:keepLines/>
+      <w:pageBreakBefore/>
+      <w:numPr>
+        <w:ilvl w:val="0"/>
+        <w:numId w:val="900"/>
+      </w:numPr>
+      <w:spacing w:before="720" w:after="480"/>
+      <w:outlineLvl w:val="0"/>
+    </w:pPr>
+    <w:rPr>
+      <w:rFonts w:asciiTheme="majorHAnsi" w:eastAsiaTheme="majorEastAsia" w:hAnsiTheme="majorHAnsi" w:cstheme="majorBidi"/>
+      <w:b/>
+      <w:color w:val="FA6432"/>
+      <w:sz w:val="42"/>
+      <w:szCs w:val="42"/>
+    </w:rPr>
+  </w:style>
+  <w:style w:type="paragraph" w:styleId="Heading2">
+    <w:name w:val="heading 2"/>
+    <w:basedOn w:val="Normal"/>
+    <w:next w:val="BodyText"/>
+    <w:link w:val="Heading2Char"/>
+    <w:uiPriority w:val="9"/>
+    <w:qFormat/>
+    <w:pPr>
+      <w:keepNext/>
+      <w:keepLines/>
+      <w:numPr>
+        <w:ilvl w:val="1"/>
+        <w:numId w:val="900"/>
+      </w:numPr>
+      <w:spacing w:before="240" w:after="240"/>
+      <w:outlineLvl w:val="1"/>
+    </w:pPr>
+    <w:rPr>
+      <w:rFonts w:asciiTheme="majorHAnsi" w:eastAsiaTheme="majorEastAsia" w:hAnsiTheme="majorHAnsi" w:cstheme="majorBidi"/>
+      <w:b/>
+      <w:color w:val="00283C"/>
+      <w:sz w:val="30"/>
+      <w:szCs w:val="30"/>
+    </w:rPr>
+  </w:style>
+  <w:style w:type="paragraph" w:styleId="Heading3">
+    <w:name w:val="heading 3"/>
+    <w:basedOn w:val="Normal"/>
+    <w:next w:val="BodyText"/>
+    <w:link w:val="Heading3Char"/>
+    <w:uiPriority w:val="9"/>
+    <w:qFormat/>
+    <w:pPr>
+      <w:keepNext/>
+      <w:keepLines/>
+      <w:numPr>
+        <w:ilvl w:val="2"/>
+        <w:numId w:val="900"/>
+      </w:numPr>
+      <w:spacing w:before="360" w:after="240"/>
+      <w:outlineLvl w:val="2"/>
+    </w:pPr>
+    <w:rPr>
+      <w:rFonts w:asciiTheme="majorHAnsi" w:eastAsiaTheme="majorEastAsia" w:hAnsiTheme="majorHAnsi" w:cstheme="majorBidi"/>
+      <w:b/>
+      <w:color w:val="FA6432"/>
+      <w:sz w:val="26"/>
+      <w:szCs w:val="26"/>
+    </w:rPr>
+  </w:style>
+  <w:style w:type="paragraph" w:styleId="Heading4">
+    <w:name w:val="heading 4"/>
+    <w:basedOn w:val="Normal"/>
+    <w:next w:val="BodyText"/>
+    <w:link w:val="Heading4Char"/>
+    <w:uiPriority w:val="9"/>
+    <w:qFormat/>
+    <w:pPr>
+      <w:keepNext/>
+      <w:keepLines/>
+      <w:numPr>
+        <w:ilvl w:val="3"/>
+        <w:numId w:val="900"/>
+      </w:numPr>
+      <w:spacing w:before="360" w:after="240"/>
+      <w:outlineLvl w:val="3"/>
+    </w:pPr>
+    <w:rPr>
+      <w:rFonts w:asciiTheme="majorHAnsi" w:eastAsiaTheme="majorEastAsia" w:hAnsiTheme="majorHAnsi" w:cstheme="majorBidi"/>
+      <w:b/>
+      <w:i/>
+      <w:iCs/>
+      <w:color w:val="00283C"/>
+      <w:sz w:val="24"/>
+      <w:szCs w:val="24"/>
+    </w:rPr>
+  </w:style>
+  <w:style w:type="paragraph" w:styleId="Heading5">
+    <w:name w:val="heading 5"/>
+    <w:basedOn w:val="Normal"/>
+    <w:next w:val="BodyText"/>
+    <w:link w:val="Heading5Char"/>
+    <w:uiPriority w:val="9"/>
+    <w:qFormat/>
+    <w:pPr>
+      <w:keepNext/>
+      <w:keepLines/>
+      <w:spacing w:before="360" w:after="240"/>
+      <w:outlineLvl w:val="4"/>
+    </w:pPr>
+    <w:rPr>
+      <w:b/>
+      <w:caps/>
+      <w:color w:val="FA6432"/>
+      <w:sz w:val="22"/>
+      <w:szCs w:val="22"/>
+    </w:rPr>
+  </w:style>
+  <w:style w:type="paragraph" w:styleId="Heading6">
+    <w:name w:val="heading 6"/>
+    <w:basedOn w:val="Normal"/>
+    <w:next w:val="BodyText"/>
+    <w:link w:val="Heading6Char"/>
+    <w:uiPriority w:val="9"/>
+    <w:qFormat/>
+    <w:pPr>
+      <w:keepNext/>
+      <w:keepLines/>
+      <w:spacing w:before="360" w:after="240"/>
+      <w:outlineLvl w:val="5"/>
+    </w:pPr>
+    <w:rPr>
+      <w:b/>
+      <w:caps/>
+      <w:color w:val="00283C"/>
+      <w:sz w:val="22"/>
+      <w:szCs w:val="22"/>
+    </w:rPr>
+  </w:style>
+  <w:style w:type="paragraph" w:styleId="Heading7">
+    <w:name w:val="heading 7"/>
+    <w:basedOn w:val="Normal"/>
+    <w:next w:val="BodyText"/>
+    <w:link w:val="Heading7Char"/>
+    <w:uiPriority w:val="9"/>
+    <w:semiHidden/>
+    <w:unhideWhenUsed/>
+    <w:qFormat/>
     <w:rsid w:val="00A10FD9"/>
     <w:pPr>
       <w:keepNext/>
       <w:keepLines/>
-      <w:spacing w:before="360" w:after="80"/>
-      <w:outlineLvl w:val="0"/>
-    </w:pPr>
+      <w:spacing w:before="40" w:after="0"/>
+      <w:outlineLvl w:val="6"/>
+    </w:pPr>
+    <w:rPr>
+      <w:rFonts w:eastAsiaTheme="majorEastAsia" w:cstheme="majorBidi"/>
+      <w:color w:val="595959" w:themeColor="text1" w:themeTint="A6"/>
+    </w:rPr>
+  </w:style>
+  <w:style w:type="paragraph" w:styleId="Heading8">
+    <w:name w:val="heading 8"/>
+    <w:basedOn w:val="Normal"/>
+    <w:next w:val="BodyText"/>
+    <w:link w:val="Heading8Char"/>
+    <w:uiPriority w:val="9"/>
+    <w:semiHidden/>
+    <w:unhideWhenUsed/>
+    <w:qFormat/>
+    <w:rsid w:val="00A10FD9"/>
+    <w:pPr>
+      <w:keepNext/>
+      <w:keepLines/>
+      <w:spacing w:after="0"/>
+      <w:outlineLvl w:val="7"/>
+    </w:pPr>
+    <w:rPr>
+      <w:rFonts w:eastAsiaTheme="majorEastAsia" w:cstheme="majorBidi"/>
+      <w:i/>
+      <w:iCs/>
+      <w:color w:val="272727" w:themeColor="text1" w:themeTint="D8"/>
+    </w:rPr>
+  </w:style>
+  <w:style w:type="paragraph" w:styleId="Heading9">
+    <w:name w:val="heading 9"/>
+    <w:basedOn w:val="Normal"/>
+    <w:next w:val="BodyText"/>
+    <w:link w:val="Heading9Char"/>
+    <w:uiPriority w:val="9"/>
+    <w:semiHidden/>
+    <w:unhideWhenUsed/>
+    <w:qFormat/>
+    <w:rsid w:val="00A10FD9"/>
+    <w:pPr>
+      <w:keepNext/>
+      <w:keepLines/>
+      <w:spacing w:after="0"/>
+      <w:outlineLvl w:val="8"/>
+    </w:pPr>
+    <w:rPr>
+      <w:rFonts w:eastAsiaTheme="majorEastAsia" w:cstheme="majorBidi"/>
+      <w:color w:val="272727" w:themeColor="text1" w:themeTint="D8"/>
+    </w:rPr>
+  </w:style>
+  <w:style w:type="character" w:customStyle="1" w:styleId="Heading1Char">
+    <w:name w:val="Heading 1 Char"/>
+    <w:basedOn w:val="DefaultParagraphFont"/>
+    <w:link w:val="Heading1"/>
+    <w:uiPriority w:val="9"/>
+    <w:rsid w:val="00A10FD9"/>
     <w:rPr>
       <w:rFonts w:asciiTheme="majorHAnsi" w:eastAsiaTheme="majorEastAsia" w:hAnsiTheme="majorHAnsi" w:cstheme="majorBidi"/>
       <w:color w:val="0F4761" w:themeColor="accent1" w:themeShade="BF"/>
@@ -679,22 +958,13 @@
       <w:szCs w:val="40"/>
     </w:rPr>
   </w:style>
-  <w:style w:type="paragraph" w:styleId="Heading2">
-    <w:name w:val="heading 2"/>
-    <w:basedOn w:val="Normal"/>
-    <w:next w:val="BodyText"/>
-    <w:link w:val="Heading2Char"/>
+  <w:style w:type="character" w:customStyle="1" w:styleId="Heading2Char">
+    <w:name w:val="Heading 2 Char"/>
+    <w:basedOn w:val="DefaultParagraphFont"/>
+    <w:link w:val="Heading2"/>
     <w:uiPriority w:val="9"/>
     <w:semiHidden/>
-    <w:unhideWhenUsed/>
-    <w:qFormat/>
     <w:rsid w:val="00A10FD9"/>
-    <w:pPr>
-      <w:keepNext/>
-      <w:keepLines/>
-      <w:spacing w:before="160" w:after="80"/>
-      <w:outlineLvl w:val="1"/>
-    </w:pPr>
     <w:rPr>
       <w:rFonts w:asciiTheme="majorHAnsi" w:eastAsiaTheme="majorEastAsia" w:hAnsiTheme="majorHAnsi" w:cstheme="majorBidi"/>
       <w:color w:val="0F4761" w:themeColor="accent1" w:themeShade="BF"/>
@@ -702,22 +972,13 @@
       <w:szCs w:val="32"/>
     </w:rPr>
   </w:style>
-  <w:style w:type="paragraph" w:styleId="Heading3">
-    <w:name w:val="heading 3"/>
-    <w:basedOn w:val="Normal"/>
-    <w:next w:val="BodyText"/>
-    <w:link w:val="Heading3Char"/>
+  <w:style w:type="character" w:customStyle="1" w:styleId="Heading3Char">
+    <w:name w:val="Heading 3 Char"/>
+    <w:basedOn w:val="DefaultParagraphFont"/>
+    <w:link w:val="Heading3"/>
     <w:uiPriority w:val="9"/>
     <w:semiHidden/>
-    <w:unhideWhenUsed/>
-    <w:qFormat/>
     <w:rsid w:val="00A10FD9"/>
-    <w:pPr>
-      <w:keepNext/>
-      <w:keepLines/>
-      <w:spacing w:before="160" w:after="80"/>
-      <w:outlineLvl w:val="2"/>
-    </w:pPr>
     <w:rPr>
       <w:rFonts w:eastAsiaTheme="majorEastAsia" w:cstheme="majorBidi"/>
       <w:color w:val="0F4761" w:themeColor="accent1" w:themeShade="BF"/>
@@ -725,22 +986,13 @@
       <w:szCs w:val="28"/>
     </w:rPr>
   </w:style>
-  <w:style w:type="paragraph" w:styleId="Heading4">
-    <w:name w:val="heading 4"/>
-    <w:basedOn w:val="Normal"/>
-    <w:next w:val="BodyText"/>
-    <w:link w:val="Heading4Char"/>
+  <w:style w:type="character" w:customStyle="1" w:styleId="Heading4Char">
+    <w:name w:val="Heading 4 Char"/>
+    <w:basedOn w:val="DefaultParagraphFont"/>
+    <w:link w:val="Heading4"/>
     <w:uiPriority w:val="9"/>
     <w:semiHidden/>
-    <w:unhideWhenUsed/>
-    <w:qFormat/>
     <w:rsid w:val="00A10FD9"/>
-    <w:pPr>
-      <w:keepNext/>
-      <w:keepLines/>
-      <w:spacing w:before="80" w:after="40"/>
-      <w:outlineLvl w:val="3"/>
-    </w:pPr>
     <w:rPr>
       <w:rFonts w:eastAsiaTheme="majorEastAsia" w:cstheme="majorBidi"/>
       <w:i/>
@@ -748,43 +1000,25 @@
       <w:color w:val="0F4761" w:themeColor="accent1" w:themeShade="BF"/>
     </w:rPr>
   </w:style>
-  <w:style w:type="paragraph" w:styleId="Heading5">
-    <w:name w:val="heading 5"/>
-    <w:basedOn w:val="Normal"/>
-    <w:next w:val="BodyText"/>
-    <w:link w:val="Heading5Char"/>
+  <w:style w:type="character" w:customStyle="1" w:styleId="Heading5Char">
+    <w:name w:val="Heading 5 Char"/>
+    <w:basedOn w:val="DefaultParagraphFont"/>
+    <w:link w:val="Heading5"/>
     <w:uiPriority w:val="9"/>
     <w:semiHidden/>
-    <w:unhideWhenUsed/>
-    <w:qFormat/>
     <w:rsid w:val="00A10FD9"/>
-    <w:pPr>
-      <w:keepNext/>
-      <w:keepLines/>
-      <w:spacing w:before="80" w:after="40"/>
-      <w:outlineLvl w:val="4"/>
-    </w:pPr>
     <w:rPr>
       <w:rFonts w:eastAsiaTheme="majorEastAsia" w:cstheme="majorBidi"/>
       <w:color w:val="0F4761" w:themeColor="accent1" w:themeShade="BF"/>
     </w:rPr>
   </w:style>
-  <w:style w:type="paragraph" w:styleId="Heading6">
-    <w:name w:val="heading 6"/>
-    <w:basedOn w:val="Normal"/>
-    <w:next w:val="BodyText"/>
-    <w:link w:val="Heading6Char"/>
+  <w:style w:type="character" w:customStyle="1" w:styleId="Heading6Char">
+    <w:name w:val="Heading 6 Char"/>
+    <w:basedOn w:val="DefaultParagraphFont"/>
+    <w:link w:val="Heading6"/>
     <w:uiPriority w:val="9"/>
     <w:semiHidden/>
-    <w:unhideWhenUsed/>
-    <w:qFormat/>
     <w:rsid w:val="00A10FD9"/>
-    <w:pPr>
-      <w:keepNext/>
-      <w:keepLines/>
-      <w:spacing w:before="40" w:after="0"/>
-      <w:outlineLvl w:val="5"/>
-    </w:pPr>
     <w:rPr>
       <w:rFonts w:eastAsiaTheme="majorEastAsia" w:cstheme="majorBidi"/>
       <w:i/>
@@ -792,43 +1026,25 @@
       <w:color w:val="595959" w:themeColor="text1" w:themeTint="A6"/>
     </w:rPr>
   </w:style>
-  <w:style w:type="paragraph" w:styleId="Heading7">
-    <w:name w:val="heading 7"/>
-    <w:basedOn w:val="Normal"/>
-    <w:next w:val="BodyText"/>
-    <w:link w:val="Heading7Char"/>
+  <w:style w:type="character" w:customStyle="1" w:styleId="Heading7Char">
+    <w:name w:val="Heading 7 Char"/>
+    <w:basedOn w:val="DefaultParagraphFont"/>
+    <w:link w:val="Heading7"/>
     <w:uiPriority w:val="9"/>
     <w:semiHidden/>
-    <w:unhideWhenUsed/>
-    <w:qFormat/>
     <w:rsid w:val="00A10FD9"/>
-    <w:pPr>
-      <w:keepNext/>
-      <w:keepLines/>
-      <w:spacing w:before="40" w:after="0"/>
-      <w:outlineLvl w:val="6"/>
-    </w:pPr>
     <w:rPr>
       <w:rFonts w:eastAsiaTheme="majorEastAsia" w:cstheme="majorBidi"/>
       <w:color w:val="595959" w:themeColor="text1" w:themeTint="A6"/>
     </w:rPr>
   </w:style>
-  <w:style w:type="paragraph" w:styleId="Heading8">
-    <w:name w:val="heading 8"/>
-    <w:basedOn w:val="Normal"/>
-    <w:next w:val="BodyText"/>
-    <w:link w:val="Heading8Char"/>
+  <w:style w:type="character" w:customStyle="1" w:styleId="Heading8Char">
+    <w:name w:val="Heading 8 Char"/>
+    <w:basedOn w:val="DefaultParagraphFont"/>
+    <w:link w:val="Heading8"/>
     <w:uiPriority w:val="9"/>
     <w:semiHidden/>
-    <w:unhideWhenUsed/>
-    <w:qFormat/>
     <w:rsid w:val="00A10FD9"/>
-    <w:pPr>
-      <w:keepNext/>
-      <w:keepLines/>
-      <w:spacing w:after="0"/>
-      <w:outlineLvl w:val="7"/>
-    </w:pPr>
     <w:rPr>
       <w:rFonts w:eastAsiaTheme="majorEastAsia" w:cstheme="majorBidi"/>
       <w:i/>
@@ -836,134 +1052,6 @@
       <w:color w:val="272727" w:themeColor="text1" w:themeTint="D8"/>
     </w:rPr>
   </w:style>
-  <w:style w:type="paragraph" w:styleId="Heading9">
-    <w:name w:val="heading 9"/>
-    <w:basedOn w:val="Normal"/>
-    <w:next w:val="BodyText"/>
-    <w:link w:val="Heading9Char"/>
-    <w:uiPriority w:val="9"/>
-    <w:semiHidden/>
-    <w:unhideWhenUsed/>
-    <w:qFormat/>
-    <w:rsid w:val="00A10FD9"/>
-    <w:pPr>
-      <w:keepNext/>
-      <w:keepLines/>
-      <w:spacing w:after="0"/>
-      <w:outlineLvl w:val="8"/>
-    </w:pPr>
-    <w:rPr>
-      <w:rFonts w:eastAsiaTheme="majorEastAsia" w:cstheme="majorBidi"/>
-      <w:color w:val="272727" w:themeColor="text1" w:themeTint="D8"/>
-    </w:rPr>
-  </w:style>
-  <w:style w:type="character" w:customStyle="1" w:styleId="Heading1Char">
-    <w:name w:val="Heading 1 Char"/>
-    <w:basedOn w:val="DefaultParagraphFont"/>
-    <w:link w:val="Heading1"/>
-    <w:uiPriority w:val="9"/>
-    <w:rsid w:val="00A10FD9"/>
-    <w:rPr>
-      <w:rFonts w:asciiTheme="majorHAnsi" w:eastAsiaTheme="majorEastAsia" w:hAnsiTheme="majorHAnsi" w:cstheme="majorBidi"/>
-      <w:color w:val="0F4761" w:themeColor="accent1" w:themeShade="BF"/>
-      <w:sz w:val="40"/>
-      <w:szCs w:val="40"/>
-    </w:rPr>
-  </w:style>
-  <w:style w:type="character" w:customStyle="1" w:styleId="Heading2Char">
-    <w:name w:val="Heading 2 Char"/>
-    <w:basedOn w:val="DefaultParagraphFont"/>
-    <w:link w:val="Heading2"/>
-    <w:uiPriority w:val="9"/>
-    <w:semiHidden/>
-    <w:rsid w:val="00A10FD9"/>
-    <w:rPr>
-      <w:rFonts w:asciiTheme="majorHAnsi" w:eastAsiaTheme="majorEastAsia" w:hAnsiTheme="majorHAnsi" w:cstheme="majorBidi"/>
-      <w:color w:val="0F4761" w:themeColor="accent1" w:themeShade="BF"/>
-      <w:sz w:val="32"/>
-      <w:szCs w:val="32"/>
-    </w:rPr>
-  </w:style>
-  <w:style w:type="character" w:customStyle="1" w:styleId="Heading3Char">
-    <w:name w:val="Heading 3 Char"/>
-    <w:basedOn w:val="DefaultParagraphFont"/>
-    <w:link w:val="Heading3"/>
-    <w:uiPriority w:val="9"/>
-    <w:semiHidden/>
-    <w:rsid w:val="00A10FD9"/>
-    <w:rPr>
-      <w:rFonts w:eastAsiaTheme="majorEastAsia" w:cstheme="majorBidi"/>
-      <w:color w:val="0F4761" w:themeColor="accent1" w:themeShade="BF"/>
-      <w:sz w:val="28"/>
-      <w:szCs w:val="28"/>
-    </w:rPr>
-  </w:style>
-  <w:style w:type="character" w:customStyle="1" w:styleId="Heading4Char">
-    <w:name w:val="Heading 4 Char"/>
-    <w:basedOn w:val="DefaultParagraphFont"/>
-    <w:link w:val="Heading4"/>
-    <w:uiPriority w:val="9"/>
-    <w:semiHidden/>
-    <w:rsid w:val="00A10FD9"/>
-    <w:rPr>
-      <w:rFonts w:eastAsiaTheme="majorEastAsia" w:cstheme="majorBidi"/>
-      <w:i/>
-      <w:iCs/>
-      <w:color w:val="0F4761" w:themeColor="accent1" w:themeShade="BF"/>
-    </w:rPr>
-  </w:style>
-  <w:style w:type="character" w:customStyle="1" w:styleId="Heading5Char">
-    <w:name w:val="Heading 5 Char"/>
-    <w:basedOn w:val="DefaultParagraphFont"/>
-    <w:link w:val="Heading5"/>
-    <w:uiPriority w:val="9"/>
-    <w:semiHidden/>
-    <w:rsid w:val="00A10FD9"/>
-    <w:rPr>
-      <w:rFonts w:eastAsiaTheme="majorEastAsia" w:cstheme="majorBidi"/>
-      <w:color w:val="0F4761" w:themeColor="accent1" w:themeShade="BF"/>
-    </w:rPr>
-  </w:style>
-  <w:style w:type="character" w:customStyle="1" w:styleId="Heading6Char">
-    <w:name w:val="Heading 6 Char"/>
-    <w:basedOn w:val="DefaultParagraphFont"/>
-    <w:link w:val="Heading6"/>
-    <w:uiPriority w:val="9"/>
-    <w:semiHidden/>
-    <w:rsid w:val="00A10FD9"/>
-    <w:rPr>
-      <w:rFonts w:eastAsiaTheme="majorEastAsia" w:cstheme="majorBidi"/>
-      <w:i/>
-      <w:iCs/>
-      <w:color w:val="595959" w:themeColor="text1" w:themeTint="A6"/>
-    </w:rPr>
-  </w:style>
-  <w:style w:type="character" w:customStyle="1" w:styleId="Heading7Char">
-    <w:name w:val="Heading 7 Char"/>
-    <w:basedOn w:val="DefaultParagraphFont"/>
-    <w:link w:val="Heading7"/>
-    <w:uiPriority w:val="9"/>
-    <w:semiHidden/>
-    <w:rsid w:val="00A10FD9"/>
-    <w:rPr>
-      <w:rFonts w:eastAsiaTheme="majorEastAsia" w:cstheme="majorBidi"/>
-      <w:color w:val="595959" w:themeColor="text1" w:themeTint="A6"/>
-    </w:rPr>
-  </w:style>
-  <w:style w:type="character" w:customStyle="1" w:styleId="Heading8Char">
-    <w:name w:val="Heading 8 Char"/>
-    <w:basedOn w:val="DefaultParagraphFont"/>
-    <w:link w:val="Heading8"/>
-    <w:uiPriority w:val="9"/>
-    <w:semiHidden/>
-    <w:rsid w:val="00A10FD9"/>
-    <w:rPr>
-      <w:rFonts w:eastAsiaTheme="majorEastAsia" w:cstheme="majorBidi"/>
-      <w:i/>
-      <w:iCs/>
-      <w:color w:val="272727" w:themeColor="text1" w:themeTint="D8"/>
-    </w:rPr>
-  </w:style>
   <w:style w:type="character" w:customStyle="1" w:styleId="Heading9Char">
     <w:name w:val="Heading 9 Char"/>
     <w:basedOn w:val="DefaultParagraphFont"/>
@@ -987,6 +1075,10 @@
       <w:spacing w:before="100" w:after="100"/>
       <w:ind w:firstLine="0" w:left="480" w:right="480"/>
     </w:pPr>
+    <w:rPr>
+      <w:i/>
+      <w:color w:val="595959"/>
+    </w:rPr>
   </w:style>
   <w:style w:type="paragraph" w:styleId="FootnoteText">
     <w:name w:val="Footnote Text"/>
@@ -1021,19 +1113,25 @@
     <w:qFormat/>
     <w:tblPr>
       <w:tblInd w:w="0" w:type="dxa"/>
+      <w:tblBorders>
+        <w:insideH w:val="single" w:sz="4" w:space="0" w:color="AABDCA"/>
+        <w:insideV w:val="single" w:sz="4" w:space="0" w:color="AABDCA"/>
+      </w:tblBorders>
       <w:tblCellMar>
-        <w:top w:w="0" w:type="dxa"/>
-        <w:left w:w="108" w:type="dxa"/>
-        <w:bottom w:w="0" w:type="dxa"/>
-        <w:right w:w="108" w:type="dxa"/>
+        <w:top w:w="57" w:type="dxa"/>
+        <w:left w:w="170" w:type="dxa"/>
+        <w:bottom w:w="57" w:type="dxa"/>
+        <w:right w:w="170" w:type="dxa"/>
       </w:tblCellMar>
     </w:tblPr>
     <w:tblStylePr w:type="firstRow">
+      <w:rPr>
+        <w:b/>
+        <w:color w:val="FFFFFF"/>
+      </w:rPr>
       <w:tcPr>
-        <w:tcBorders>
-          <w:bottom w:val="single"/>
-        </w:tcBorders>
-        <w:vAlign w:val="bottom"/>
+        <w:shd w:val="clear" w:color="auto" w:fill="00283C"/>
+        <w:vAlign w:val="center"/>
       </w:tcPr>
     </w:tblStylePr>
   </w:style>
@@ -1063,6 +1161,8 @@
     </w:pPr>
     <w:rPr>
       <w:i/>
+      <w:sz w:val="18"/>
+      <w:szCs w:val="18"/>
     </w:rPr>
   </w:style>
   <w:style w:type="paragraph" w:customStyle="1" w:styleId="TableCaption">
@@ -1097,6 +1197,7 @@
     <w:basedOn w:val="BodyTextChar"/>
     <w:rPr>
       <w:rFonts w:ascii="Consolas" w:hAnsi="Consolas"/>
+      <w:shd w:val="clear" w:color="auto" w:fill="E8EBEE"/>
       <w:sz w:val="22"/>
     </w:rPr>
   </w:style>
@@ -1115,7 +1216,8 @@
     <w:name w:val="Hyperlink"/>
     <w:basedOn w:val="BodyTextChar"/>
     <w:rPr>
-      <w:color w:val="4F81BD" w:themeColor="accent1"/>
+      <w:color w:val="00637C"/>
+      <w:u w:val="single"/>
     </w:rPr>
   </w:style>
   <w:style w:type="paragraph" w:styleId="TOCHeading">
@@ -1126,37 +1228,56 @@
     <w:unhideWhenUsed/>
     <w:qFormat/>
     <w:pPr>
-      <w:spacing w:before="240" w:line="259" w:lineRule="auto"/>
+      <w:numPr>
+        <w:numId w:val="0"/>
+      </w:numPr>
+      <w:spacing w:before="240" w:after="480"/>
       <w:outlineLvl w:val="9"/>
     </w:pPr>
     <w:rPr>
       <w:rFonts w:asciiTheme="majorHAnsi" w:eastAsiaTheme="majorEastAsia" w:hAnsiTheme="majorHAnsi" w:cstheme="majorBidi"/>
-      <w:b w:val="0"/>
-      <w:bCs w:val="0"/>
-      <w:color w:val="365F91" w:themeColor="accent1" w:themeShade="BF"/>
-    </w:rPr>
-  </w:style>
-  <w:style w:type="paragraph" w:styleId="AlertTitle">
-    <w:name w:val="Alert Title"/>
+      <w:b/>
+      <w:color w:val="FA6432"/>
+    </w:rPr>
+  </w:style>
+  <w:style w:type="paragraph" w:customStyle="1" w:styleId="SourceCode">
+    <w:name w:val="Source Code"/>
+    <w:basedOn w:val="Normal"/>
+    <w:next w:val="BodyText"/>
+    <w:qFormat/>
+    <w:pPr>
+      <w:keepLines/>
+      <w:shd w:val="clear" w:color="auto" w:fill="E8EBEE"/>
+      <w:spacing w:before="120" w:after="240" w:line="240" w:lineRule="auto"/>
+      <w:ind w:left="120" w:right="120"/>
+    </w:pPr>
+    <w:rPr>
+      <w:rFonts w:ascii="Consolas" w:hAnsi="Consolas"/>
+      <w:sz w:val="20"/>
+      <w:szCs w:val="20"/>
+    </w:rPr>
+  </w:style>
+  <w:style w:type="paragraph" w:customStyle="1" w:styleId="AlertTitleNote">
+    <w:name w:val="Alert Title Note"/>
     <w:basedOn w:val="BodyText"/>
-    <w:next w:val="AlertBody"/>
+    <w:next w:val="AlertBodyNote"/>
     <w:qFormat/>
     <w:pPr>
       <w:keepNext/>
       <w:pBdr>
         <w:left w:val="single" w:sz="24" w:space="8" w:color="4BAFE1"/>
       </w:pBdr>
-      <w:shd w:val="clear" w:color="auto" w:fill="EAF6FC"/>
+      <w:shd w:val="clear" w:color="auto" w:fill="E9F5FB"/>
       <w:spacing w:before="180" w:after="0"/>
       <w:ind w:left="120"/>
     </w:pPr>
     <w:rPr>
       <w:b/>
-      <w:color w:val="4BAFE1"/>
-    </w:rPr>
-  </w:style>
-  <w:style w:type="paragraph" w:styleId="AlertBody">
-    <w:name w:val="Alert Body"/>
+      <w:color w:val="439DCA"/>
+    </w:rPr>
+  </w:style>
+  <w:style w:type="paragraph" w:customStyle="1" w:styleId="AlertBodyNote">
+    <w:name w:val="Alert Body Note"/>
     <w:basedOn w:val="BodyText"/>
     <w:next w:val="BodyText"/>
     <w:qFormat/>
@@ -1164,7 +1285,172 @@
       <w:pBdr>
         <w:left w:val="single" w:sz="24" w:space="8" w:color="4BAFE1"/>
       </w:pBdr>
-      <w:shd w:val="clear" w:color="auto" w:fill="EAF6FC"/>
+      <w:shd w:val="clear" w:color="auto" w:fill="E9F5FB"/>
+      <w:spacing w:before="0" w:after="180"/>
+      <w:ind w:left="120"/>
+    </w:pPr>
+  </w:style>
+  <w:style w:type="paragraph" w:customStyle="1" w:styleId="AlertTitleTip">
+    <w:name w:val="Alert Title Tip"/>
+    <w:basedOn w:val="BodyText"/>
+    <w:next w:val="AlertBodyTip"/>
+    <w:qFormat/>
+    <w:pPr>
+      <w:keepNext/>
+      <w:pBdr>
+        <w:left w:val="single" w:sz="24" w:space="8" w:color="64C8C8"/>
+      </w:pBdr>
+      <w:shd w:val="clear" w:color="auto" w:fill="ECF8F8"/>
+      <w:spacing w:before="180" w:after="0"/>
+      <w:ind w:left="120"/>
+    </w:pPr>
+    <w:rPr>
+      <w:b/>
+      <w:color w:val="5AB4B4"/>
+    </w:rPr>
+  </w:style>
+  <w:style w:type="paragraph" w:customStyle="1" w:styleId="AlertBodyTip">
+    <w:name w:val="Alert Body Tip"/>
+    <w:basedOn w:val="BodyText"/>
+    <w:next w:val="BodyText"/>
+    <w:qFormat/>
+    <w:pPr>
+      <w:pBdr>
+        <w:left w:val="single" w:sz="24" w:space="8" w:color="64C8C8"/>
+      </w:pBdr>
+      <w:shd w:val="clear" w:color="auto" w:fill="ECF8F8"/>
+      <w:spacing w:before="0" w:after="180"/>
+      <w:ind w:left="120"/>
+    </w:pPr>
+  </w:style>
+  <w:style w:type="paragraph" w:customStyle="1" w:styleId="AlertTitleImportant">
+    <w:name w:val="Alert Title Important"/>
+    <w:basedOn w:val="BodyText"/>
+    <w:next w:val="AlertBodyImportant"/>
+    <w:qFormat/>
+    <w:pPr>
+      <w:keepNext/>
+      <w:pBdr>
+        <w:left w:val="single" w:sz="24" w:space="8" w:color="967DC8"/>
+      </w:pBdr>
+      <w:shd w:val="clear" w:color="auto" w:fill="F2EFF8"/>
+      <w:spacing w:before="180" w:after="0"/>
+      <w:ind w:left="120"/>
+    </w:pPr>
+    <w:rPr>
+      <w:b/>
+      <w:color w:val="8770B4"/>
+    </w:rPr>
+  </w:style>
+  <w:style w:type="paragraph" w:customStyle="1" w:styleId="AlertBodyImportant">
+    <w:name w:val="Alert Body Important"/>
+    <w:basedOn w:val="BodyText"/>
+    <w:next w:val="BodyText"/>
+    <w:qFormat/>
+    <w:pPr>
+      <w:pBdr>
+        <w:left w:val="single" w:sz="24" w:space="8" w:color="967DC8"/>
+      </w:pBdr>
+      <w:shd w:val="clear" w:color="auto" w:fill="F2EFF8"/>
+      <w:spacing w:before="0" w:after="180"/>
+      <w:ind w:left="120"/>
+    </w:pPr>
+  </w:style>
+  <w:style w:type="paragraph" w:customStyle="1" w:styleId="AlertTitleWarning">
+    <w:name w:val="Alert Title Warning"/>
+    <w:basedOn w:val="BodyText"/>
+    <w:next w:val="AlertBodyWarning"/>
+    <w:qFormat/>
+    <w:pPr>
+      <w:keepNext/>
+      <w:pBdr>
+        <w:left w:val="single" w:sz="24" w:space="8" w:color="FFC87D"/>
+      </w:pBdr>
+      <w:shd w:val="clear" w:color="auto" w:fill="FFF8EF"/>
+      <w:spacing w:before="180" w:after="0"/>
+      <w:ind w:left="120"/>
+    </w:pPr>
+    <w:rPr>
+      <w:b/>
+      <w:color w:val="E5B470"/>
+    </w:rPr>
+  </w:style>
+  <w:style w:type="paragraph" w:customStyle="1" w:styleId="AlertBodyWarning">
+    <w:name w:val="Alert Body Warning"/>
+    <w:basedOn w:val="BodyText"/>
+    <w:next w:val="BodyText"/>
+    <w:qFormat/>
+    <w:pPr>
+      <w:pBdr>
+        <w:left w:val="single" w:sz="24" w:space="8" w:color="FFC87D"/>
+      </w:pBdr>
+      <w:shd w:val="clear" w:color="auto" w:fill="FFF8EF"/>
+      <w:spacing w:before="0" w:after="180"/>
+      <w:ind w:left="120"/>
+    </w:pPr>
+  </w:style>
+  <w:style w:type="paragraph" w:customStyle="1" w:styleId="AlertTitleCaution">
+    <w:name w:val="Alert Title Caution"/>
+    <w:basedOn w:val="BodyText"/>
+    <w:next w:val="AlertBodyCaution"/>
+    <w:qFormat/>
+    <w:pPr>
+      <w:keepNext/>
+      <w:pBdr>
+        <w:left w:val="single" w:sz="24" w:space="8" w:color="FA6432"/>
+      </w:pBdr>
+      <w:shd w:val="clear" w:color="auto" w:fill="FEECE6"/>
+      <w:spacing w:before="180" w:after="0"/>
+      <w:ind w:left="120"/>
+    </w:pPr>
+    <w:rPr>
+      <w:b/>
+      <w:color w:val="E15A2D"/>
+    </w:rPr>
+  </w:style>
+  <w:style w:type="paragraph" w:customStyle="1" w:styleId="AlertBodyCaution">
+    <w:name w:val="Alert Body Caution"/>
+    <w:basedOn w:val="BodyText"/>
+    <w:next w:val="BodyText"/>
+    <w:qFormat/>
+    <w:pPr>
+      <w:pBdr>
+        <w:left w:val="single" w:sz="24" w:space="8" w:color="FA6432"/>
+      </w:pBdr>
+      <w:shd w:val="clear" w:color="auto" w:fill="FEECE6"/>
+      <w:spacing w:before="0" w:after="180"/>
+      <w:ind w:left="120"/>
+    </w:pPr>
+  </w:style>
+  <w:style w:type="paragraph" w:customStyle="1" w:styleId="AlertTitleCheck">
+    <w:name w:val="Alert Title Check"/>
+    <w:basedOn w:val="BodyText"/>
+    <w:next w:val="AlertBodyCheck"/>
+    <w:qFormat/>
+    <w:pPr>
+      <w:keepNext/>
+      <w:pBdr>
+        <w:left w:val="single" w:sz="24" w:space="8" w:color="00283C"/>
+      </w:pBdr>
+      <w:shd w:val="clear" w:color="auto" w:fill="E0E5E7"/>
+      <w:spacing w:before="180" w:after="0"/>
+      <w:ind w:left="120"/>
+    </w:pPr>
+    <w:rPr>
+      <w:b/>
+      <w:color w:val="002436"/>
+    </w:rPr>
+  </w:style>
+  <w:style w:type="paragraph" w:customStyle="1" w:styleId="AlertBodyCheck">
+    <w:name w:val="Alert Body Check"/>
+    <w:basedOn w:val="BodyText"/>
+    <w:next w:val="BodyText"/>
+    <w:qFormat/>
+    <w:pPr>
+      <w:pBdr>
+        <w:left w:val="single" w:sz="24" w:space="8" w:color="00283C"/>
+      </w:pBdr>
+      <w:shd w:val="clear" w:color="auto" w:fill="E0E5E7"/>
       <w:spacing w:before="0" w:after="180"/>
       <w:ind w:left="120"/>
     </w:pPr>
@@ -1177,9 +1463,9 @@
     <w:pPr>
       <w:keepNext/>
       <w:pBdr>
-        <w:top w:val="single" w:sz="6" w:space="6" w:color="AAAAAA"/>
-        <w:left w:val="single" w:sz="6" w:space="6" w:color="AAAAAA"/>
-        <w:right w:val="single" w:sz="6" w:space="6" w:color="AAAAAA"/>
+        <w:top w:val="single" w:sz="6" w:space="6" w:color="AABDCA"/>
+        <w:left w:val="single" w:sz="6" w:space="6" w:color="AABDCA"/>
+        <w:right w:val="single" w:sz="6" w:space="6" w:color="AABDCA"/>
       </w:pBdr>
       <w:spacing w:before="180" w:after="0"/>
       <w:ind w:left="120" w:right="120"/>
@@ -1195,9 +1481,9 @@
     <w:qFormat/>
     <w:pPr>
       <w:pBdr>
-        <w:left w:val="single" w:sz="6" w:space="6" w:color="AAAAAA"/>
-        <w:bottom w:val="single" w:sz="6" w:space="6" w:color="AAAAAA"/>
-        <w:right w:val="single" w:sz="6" w:space="6" w:color="AAAAAA"/>
+        <w:left w:val="single" w:sz="6" w:space="6" w:color="AABDCA"/>
+        <w:bottom w:val="single" w:sz="6" w:space="6" w:color="AABDCA"/>
+        <w:right w:val="single" w:sz="6" w:space="6" w:color="AABDCA"/>
       </w:pBdr>
       <w:spacing w:before="0" w:after="180"/>
       <w:ind w:left="120" w:right="120"/>
@@ -1211,6 +1497,38 @@
     <w:pPr>
       <w:spacing w:before="120" w:after="120"/>
     </w:pPr>
+  </w:style>
+  <w:style w:type="paragraph" w:styleId="Header">
+    <w:name w:val="header"/>
+    <w:basedOn w:val="Normal"/>
+    <w:pPr>
+      <w:spacing w:before="0" w:after="0"/>
+      <w:tabs>
+        <w:tab w:val="center" w:pos="4536"/>
+        <w:tab w:val="right" w:pos="9070"/>
+      </w:tabs>
+    </w:pPr>
+    <w:rPr>
+      <w:color w:val="595959"/>
+      <w:sz w:val="18"/>
+      <w:szCs w:val="18"/>
+    </w:rPr>
+  </w:style>
+  <w:style w:type="paragraph" w:styleId="Footer">
+    <w:name w:val="footer"/>
+    <w:basedOn w:val="Normal"/>
+    <w:pPr>
+      <w:spacing w:before="0" w:after="0"/>
+      <w:tabs>
+        <w:tab w:val="center" w:pos="4536"/>
+        <w:tab w:val="right" w:pos="9070"/>
+      </w:tabs>
+    </w:pPr>
+    <w:rPr>
+      <w:color w:val="595959"/>
+      <w:sz w:val="18"/>
+      <w:szCs w:val="18"/>
+    </w:rPr>
   </w:style>
 </w:styles>
 </file>
@@ -1226,39 +1544,39 @@
         <a:sysClr val="window" lastClr="FFFFFF"/>
       </a:lt1>
       <a:dk2>
-        <a:srgbClr val="0E2841"/>
+        <a:srgbClr val="00283C"/>
       </a:dk2>
       <a:lt2>
-        <a:srgbClr val="E8E8E8"/>
+        <a:srgbClr val="FA6432"/>
       </a:lt2>
       <a:accent1>
-        <a:srgbClr val="156082"/>
+        <a:srgbClr val="FA6432"/>
       </a:accent1>
       <a:accent2>
-        <a:srgbClr val="E97132"/>
+        <a:srgbClr val="FFC87B"/>
       </a:accent2>
       <a:accent3>
-        <a:srgbClr val="196B24"/>
+        <a:srgbClr val="00627B"/>
       </a:accent3>
       <a:accent4>
-        <a:srgbClr val="0F9ED5"/>
+        <a:srgbClr val="63C8C8"/>
       </a:accent4>
       <a:accent5>
-        <a:srgbClr val="A02B93"/>
+        <a:srgbClr val="86D278"/>
       </a:accent5>
       <a:accent6>
-        <a:srgbClr val="4EA72E"/>
+        <a:srgbClr val="C8E163"/>
       </a:accent6>
       <a:hlink>
-        <a:srgbClr val="467886"/>
+        <a:srgbClr val="00637C"/>
       </a:hlink>
       <a:folHlink>
-        <a:srgbClr val="96607D"/>
+        <a:srgbClr val="00637C"/>
       </a:folHlink>
     </a:clrScheme>
     <a:fontScheme name="Office">
       <a:majorFont>
-        <a:latin typeface="Aptos Display" panose="02110004020202020204"/>
+        <a:latin typeface="Century Gothic" panose="02110004020202020204"/>
         <a:ea typeface=""/>
         <a:cs typeface=""/>
         <a:font script="Jpan" typeface="游ゴシック Light"/>
@@ -1310,7 +1628,7 @@
         <a:font script="Tfng" typeface="Ebrima"/>
       </a:majorFont>
       <a:minorFont>
-        <a:latin typeface="Aptos" panose="02110004020202020204"/>
+        <a:latin typeface="Arial" panose="02110004020202020204"/>
         <a:ea typeface=""/>
         <a:cs typeface=""/>
         <a:font script="Jpan" typeface="游明朝"/>

</xml_diff>